<commit_message>
Fix 5 issues found in end-to-end test: png image registration, chart insertion, funding table field, wording consistency
- read_inputs.py: register png/jpg images into images field (no OCR)
- build_report.py: warn instead of silently dropping unconsumed image vars
- template: add chart placeholders and funding-arrival table loop
- reference: unify 四制 wording, add source-qualifier dedup rule
- example: add images and funding-table fields
- SKILL.md: document new capabilities

Co-Authored-By: Claude Opus 4.8 <noreply@anthropic.com>
</commit_message>
<xml_diff>
--- a/templates/工程类模板.docx
+++ b/templates/工程类模板.docx
@@ -3679,6 +3679,175 @@
       <w:pPr/>
       <w:r>
         <w:t>{{ 资金来源 }}</w:t>
+      </w:r>
+    </w:p>
+    <w:p>
+      <w:pPr/>
+      <w:r>
+        <w:t>资金到位情况表（金额单位：万元）</w:t>
+      </w:r>
+    </w:p>
+    <w:tbl>
+      <w:tblPr>
+        <w:tblStyle w:val="TableGrid"/>
+        <w:tblW w:type="auto" w:w="0"/>
+        <w:tblLook w:firstColumn="1" w:firstRow="1" w:lastColumn="0" w:lastRow="0" w:noHBand="0" w:noVBand="1" w:val="04A0"/>
+      </w:tblPr>
+      <w:tblGrid>
+        <w:gridCol w:w="2409"/>
+        <w:gridCol w:w="2409"/>
+        <w:gridCol w:w="2409"/>
+        <w:gridCol w:w="2409"/>
+      </w:tblGrid>
+      <w:tr>
+        <w:tc>
+          <w:tcPr>
+            <w:tcW w:type="dxa" w:w="2409"/>
+          </w:tcPr>
+          <w:p>
+            <w:r>
+              <w:t>年度</w:t>
+            </w:r>
+          </w:p>
+        </w:tc>
+        <w:tc>
+          <w:tcPr>
+            <w:tcW w:type="dxa" w:w="2409"/>
+          </w:tcPr>
+          <w:p>
+            <w:r>
+              <w:t>计划到位</w:t>
+            </w:r>
+          </w:p>
+        </w:tc>
+        <w:tc>
+          <w:tcPr>
+            <w:tcW w:type="dxa" w:w="2409"/>
+          </w:tcPr>
+          <w:p>
+            <w:r>
+              <w:t>实际到位</w:t>
+            </w:r>
+          </w:p>
+        </w:tc>
+        <w:tc>
+          <w:tcPr>
+            <w:tcW w:type="dxa" w:w="2409"/>
+          </w:tcPr>
+          <w:p>
+            <w:r>
+              <w:t>到位率</w:t>
+            </w:r>
+          </w:p>
+        </w:tc>
+      </w:tr>
+      <w:tr>
+        <w:tc>
+          <w:tcPr>
+            <w:tcW w:type="dxa" w:w="2409"/>
+          </w:tcPr>
+          <w:p>
+            <w:r>
+              <w:t>{%tr for row in 资金到位表 %}</w:t>
+            </w:r>
+          </w:p>
+        </w:tc>
+        <w:tc>
+          <w:tcPr>
+            <w:tcW w:type="dxa" w:w="2409"/>
+          </w:tcPr>
+          <w:p/>
+        </w:tc>
+        <w:tc>
+          <w:tcPr>
+            <w:tcW w:type="dxa" w:w="2409"/>
+          </w:tcPr>
+          <w:p/>
+        </w:tc>
+        <w:tc>
+          <w:tcPr>
+            <w:tcW w:type="dxa" w:w="2409"/>
+          </w:tcPr>
+          <w:p/>
+        </w:tc>
+      </w:tr>
+      <w:tr>
+        <w:tc>
+          <w:tcPr>
+            <w:tcW w:type="dxa" w:w="2409"/>
+          </w:tcPr>
+          <w:p>
+            <w:r>
+              <w:t>{{ row.年度 }}</w:t>
+            </w:r>
+          </w:p>
+        </w:tc>
+        <w:tc>
+          <w:tcPr>
+            <w:tcW w:type="dxa" w:w="2409"/>
+          </w:tcPr>
+          <w:p>
+            <w:r>
+              <w:t>{{ row.计划到位 }}</w:t>
+            </w:r>
+          </w:p>
+        </w:tc>
+        <w:tc>
+          <w:tcPr>
+            <w:tcW w:type="dxa" w:w="2409"/>
+          </w:tcPr>
+          <w:p>
+            <w:r>
+              <w:t>{{ row.实际到位 }}</w:t>
+            </w:r>
+          </w:p>
+        </w:tc>
+        <w:tc>
+          <w:tcPr>
+            <w:tcW w:type="dxa" w:w="2409"/>
+          </w:tcPr>
+          <w:p>
+            <w:r>
+              <w:t>{{ row.到位率 }}</w:t>
+            </w:r>
+          </w:p>
+        </w:tc>
+      </w:tr>
+      <w:tr>
+        <w:tc>
+          <w:tcPr>
+            <w:tcW w:type="dxa" w:w="2409"/>
+          </w:tcPr>
+          <w:p>
+            <w:r>
+              <w:t>{%tr endfor %}</w:t>
+            </w:r>
+          </w:p>
+        </w:tc>
+        <w:tc>
+          <w:tcPr>
+            <w:tcW w:type="dxa" w:w="2409"/>
+          </w:tcPr>
+          <w:p/>
+        </w:tc>
+        <w:tc>
+          <w:tcPr>
+            <w:tcW w:type="dxa" w:w="2409"/>
+          </w:tcPr>
+          <w:p/>
+        </w:tc>
+        <w:tc>
+          <w:tcPr>
+            <w:tcW w:type="dxa" w:w="2409"/>
+          </w:tcPr>
+          <w:p/>
+        </w:tc>
+      </w:tr>
+    </w:tbl>
+    <w:p>
+      <w:pPr/>
+      <w:r>
+        <w:t>{{ 资金到位图 }}</w:t>
       </w:r>
     </w:p>
     <w:p>
@@ -4350,6 +4519,12 @@
         </w:tc>
       </w:tr>
     </w:tbl>
+    <w:p>
+      <w:pPr/>
+      <w:r>
+        <w:t>{{ 投资控制图 }}</w:t>
+      </w:r>
+    </w:p>
     <w:p>
       <w:pPr>
         <w:pStyle w:val="Heading2"/>

</xml_diff>